<commit_message>
docs: add project report document
</commit_message>
<xml_diff>
--- a/docs/Project Report.docx
+++ b/docs/Project Report.docx
@@ -387,16 +387,7 @@
           <w:sz w:val="28"/>
           <w:szCs w:val="28"/>
         </w:rPr>
-        <w:t>Submitted by</w:t>
-      </w:r>
-      <w:r>
-        <w:rPr>
-          <w:b/>
-          <w:bCs/>
-          <w:sz w:val="28"/>
-          <w:szCs w:val="28"/>
-        </w:rPr>
-        <w:t xml:space="preserve"> -</w:t>
+        <w:t>Submitted by -</w:t>
       </w:r>
     </w:p>
     <w:p>
@@ -3239,12 +3230,6 @@
         <w:gridCol w:w="6747"/>
       </w:tblGrid>
       <w:tr>
-        <w:tblPrEx>
-          <w:tblCellMar>
-            <w:top w:w="0" w:type="dxa"/>
-            <w:bottom w:w="0" w:type="dxa"/>
-          </w:tblCellMar>
-        </w:tblPrEx>
         <w:trPr>
           <w:trHeight w:val="357"/>
           <w:tblHeader/>
@@ -3295,12 +3280,6 @@
         </w:tc>
       </w:tr>
       <w:tr>
-        <w:tblPrEx>
-          <w:tblCellMar>
-            <w:top w:w="0" w:type="dxa"/>
-            <w:bottom w:w="0" w:type="dxa"/>
-          </w:tblCellMar>
-        </w:tblPrEx>
         <w:trPr>
           <w:trHeight w:val="693"/>
         </w:trPr>
@@ -3336,12 +3315,6 @@
         </w:tc>
       </w:tr>
       <w:tr>
-        <w:tblPrEx>
-          <w:tblCellMar>
-            <w:top w:w="0" w:type="dxa"/>
-            <w:bottom w:w="0" w:type="dxa"/>
-          </w:tblCellMar>
-        </w:tblPrEx>
         <w:trPr>
           <w:trHeight w:val="1073"/>
         </w:trPr>
@@ -3377,12 +3350,6 @@
         </w:tc>
       </w:tr>
       <w:tr>
-        <w:tblPrEx>
-          <w:tblCellMar>
-            <w:top w:w="0" w:type="dxa"/>
-            <w:bottom w:w="0" w:type="dxa"/>
-          </w:tblCellMar>
-        </w:tblPrEx>
         <w:trPr>
           <w:trHeight w:val="693"/>
         </w:trPr>
@@ -3418,12 +3385,6 @@
         </w:tc>
       </w:tr>
       <w:tr>
-        <w:tblPrEx>
-          <w:tblCellMar>
-            <w:top w:w="0" w:type="dxa"/>
-            <w:bottom w:w="0" w:type="dxa"/>
-          </w:tblCellMar>
-        </w:tblPrEx>
         <w:trPr>
           <w:trHeight w:val="715"/>
         </w:trPr>
@@ -3459,12 +3420,6 @@
         </w:tc>
       </w:tr>
       <w:tr>
-        <w:tblPrEx>
-          <w:tblCellMar>
-            <w:top w:w="0" w:type="dxa"/>
-            <w:bottom w:w="0" w:type="dxa"/>
-          </w:tblCellMar>
-        </w:tblPrEx>
         <w:trPr>
           <w:trHeight w:val="715"/>
         </w:trPr>
@@ -3500,12 +3455,6 @@
         </w:tc>
       </w:tr>
       <w:tr>
-        <w:tblPrEx>
-          <w:tblCellMar>
-            <w:top w:w="0" w:type="dxa"/>
-            <w:bottom w:w="0" w:type="dxa"/>
-          </w:tblCellMar>
-        </w:tblPrEx>
         <w:trPr>
           <w:trHeight w:val="693"/>
         </w:trPr>
@@ -3541,12 +3490,6 @@
         </w:tc>
       </w:tr>
       <w:tr>
-        <w:tblPrEx>
-          <w:tblCellMar>
-            <w:top w:w="0" w:type="dxa"/>
-            <w:bottom w:w="0" w:type="dxa"/>
-          </w:tblCellMar>
-        </w:tblPrEx>
         <w:trPr>
           <w:trHeight w:val="715"/>
         </w:trPr>
@@ -3582,12 +3525,6 @@
         </w:tc>
       </w:tr>
       <w:tr>
-        <w:tblPrEx>
-          <w:tblCellMar>
-            <w:top w:w="0" w:type="dxa"/>
-            <w:bottom w:w="0" w:type="dxa"/>
-          </w:tblCellMar>
-        </w:tblPrEx>
         <w:trPr>
           <w:trHeight w:val="693"/>
         </w:trPr>
@@ -3623,12 +3560,6 @@
         </w:tc>
       </w:tr>
       <w:tr>
-        <w:tblPrEx>
-          <w:tblCellMar>
-            <w:top w:w="0" w:type="dxa"/>
-            <w:bottom w:w="0" w:type="dxa"/>
-          </w:tblCellMar>
-        </w:tblPrEx>
         <w:trPr>
           <w:trHeight w:val="715"/>
         </w:trPr>
@@ -3664,12 +3595,6 @@
         </w:tc>
       </w:tr>
       <w:tr>
-        <w:tblPrEx>
-          <w:tblCellMar>
-            <w:top w:w="0" w:type="dxa"/>
-            <w:bottom w:w="0" w:type="dxa"/>
-          </w:tblCellMar>
-        </w:tblPrEx>
         <w:trPr>
           <w:trHeight w:val="715"/>
         </w:trPr>
@@ -3705,12 +3630,6 @@
         </w:tc>
       </w:tr>
       <w:tr>
-        <w:tblPrEx>
-          <w:tblCellMar>
-            <w:top w:w="0" w:type="dxa"/>
-            <w:bottom w:w="0" w:type="dxa"/>
-          </w:tblCellMar>
-        </w:tblPrEx>
         <w:trPr>
           <w:trHeight w:val="334"/>
         </w:trPr>
@@ -3746,12 +3665,6 @@
         </w:tc>
       </w:tr>
       <w:tr>
-        <w:tblPrEx>
-          <w:tblCellMar>
-            <w:top w:w="0" w:type="dxa"/>
-            <w:bottom w:w="0" w:type="dxa"/>
-          </w:tblCellMar>
-        </w:tblPrEx>
         <w:trPr>
           <w:trHeight w:val="357"/>
         </w:trPr>
@@ -3787,12 +3700,6 @@
         </w:tc>
       </w:tr>
       <w:tr>
-        <w:tblPrEx>
-          <w:tblCellMar>
-            <w:top w:w="0" w:type="dxa"/>
-            <w:bottom w:w="0" w:type="dxa"/>
-          </w:tblCellMar>
-        </w:tblPrEx>
         <w:trPr>
           <w:trHeight w:val="693"/>
         </w:trPr>
@@ -3828,12 +3735,6 @@
         </w:tc>
       </w:tr>
       <w:tr>
-        <w:tblPrEx>
-          <w:tblCellMar>
-            <w:top w:w="0" w:type="dxa"/>
-            <w:bottom w:w="0" w:type="dxa"/>
-          </w:tblCellMar>
-        </w:tblPrEx>
         <w:trPr>
           <w:trHeight w:val="715"/>
         </w:trPr>
@@ -3869,12 +3770,6 @@
         </w:tc>
       </w:tr>
       <w:tr>
-        <w:tblPrEx>
-          <w:tblCellMar>
-            <w:top w:w="0" w:type="dxa"/>
-            <w:bottom w:w="0" w:type="dxa"/>
-          </w:tblCellMar>
-        </w:tblPrEx>
         <w:trPr>
           <w:trHeight w:val="334"/>
         </w:trPr>
@@ -5930,12 +5825,6 @@
         <w:gridCol w:w="1100"/>
       </w:tblGrid>
       <w:tr>
-        <w:tblPrEx>
-          <w:tblCellMar>
-            <w:top w:w="0" w:type="dxa"/>
-            <w:bottom w:w="0" w:type="dxa"/>
-          </w:tblCellMar>
-        </w:tblPrEx>
         <w:trPr>
           <w:tblHeader/>
         </w:trPr>
@@ -6073,12 +5962,6 @@
         </w:tc>
       </w:tr>
       <w:tr>
-        <w:tblPrEx>
-          <w:tblCellMar>
-            <w:top w:w="0" w:type="dxa"/>
-            <w:bottom w:w="0" w:type="dxa"/>
-          </w:tblCellMar>
-        </w:tblPrEx>
         <w:tc>
           <w:tcPr>
             <w:tcW w:w="500" w:type="dxa"/>
@@ -6171,12 +6054,6 @@
         </w:tc>
       </w:tr>
       <w:tr>
-        <w:tblPrEx>
-          <w:tblCellMar>
-            <w:top w:w="0" w:type="dxa"/>
-            <w:bottom w:w="0" w:type="dxa"/>
-          </w:tblCellMar>
-        </w:tblPrEx>
         <w:tc>
           <w:tcPr>
             <w:tcW w:w="500" w:type="dxa"/>
@@ -6269,12 +6146,6 @@
         </w:tc>
       </w:tr>
       <w:tr>
-        <w:tblPrEx>
-          <w:tblCellMar>
-            <w:top w:w="0" w:type="dxa"/>
-            <w:bottom w:w="0" w:type="dxa"/>
-          </w:tblCellMar>
-        </w:tblPrEx>
         <w:tc>
           <w:tcPr>
             <w:tcW w:w="500" w:type="dxa"/>
@@ -6408,12 +6279,6 @@
         <w:gridCol w:w="5513"/>
       </w:tblGrid>
       <w:tr>
-        <w:tblPrEx>
-          <w:tblCellMar>
-            <w:top w:w="0" w:type="dxa"/>
-            <w:bottom w:w="0" w:type="dxa"/>
-          </w:tblCellMar>
-        </w:tblPrEx>
         <w:trPr>
           <w:trHeight w:val="258"/>
           <w:tblHeader/>
@@ -6464,12 +6329,6 @@
         </w:tc>
       </w:tr>
       <w:tr>
-        <w:tblPrEx>
-          <w:tblCellMar>
-            <w:top w:w="0" w:type="dxa"/>
-            <w:bottom w:w="0" w:type="dxa"/>
-          </w:tblCellMar>
-        </w:tblPrEx>
         <w:trPr>
           <w:trHeight w:val="242"/>
         </w:trPr>
@@ -6505,12 +6364,6 @@
         </w:tc>
       </w:tr>
       <w:tr>
-        <w:tblPrEx>
-          <w:tblCellMar>
-            <w:top w:w="0" w:type="dxa"/>
-            <w:bottom w:w="0" w:type="dxa"/>
-          </w:tblCellMar>
-        </w:tblPrEx>
         <w:trPr>
           <w:trHeight w:val="258"/>
         </w:trPr>
@@ -6546,12 +6399,6 @@
         </w:tc>
       </w:tr>
       <w:tr>
-        <w:tblPrEx>
-          <w:tblCellMar>
-            <w:top w:w="0" w:type="dxa"/>
-            <w:bottom w:w="0" w:type="dxa"/>
-          </w:tblCellMar>
-        </w:tblPrEx>
         <w:trPr>
           <w:trHeight w:val="258"/>
         </w:trPr>
@@ -6587,12 +6434,6 @@
         </w:tc>
       </w:tr>
       <w:tr>
-        <w:tblPrEx>
-          <w:tblCellMar>
-            <w:top w:w="0" w:type="dxa"/>
-            <w:bottom w:w="0" w:type="dxa"/>
-          </w:tblCellMar>
-        </w:tblPrEx>
         <w:trPr>
           <w:trHeight w:val="242"/>
         </w:trPr>
@@ -6628,12 +6469,6 @@
         </w:tc>
       </w:tr>
       <w:tr>
-        <w:tblPrEx>
-          <w:tblCellMar>
-            <w:top w:w="0" w:type="dxa"/>
-            <w:bottom w:w="0" w:type="dxa"/>
-          </w:tblCellMar>
-        </w:tblPrEx>
         <w:trPr>
           <w:trHeight w:val="258"/>
         </w:trPr>
@@ -6669,12 +6504,6 @@
         </w:tc>
       </w:tr>
       <w:tr>
-        <w:tblPrEx>
-          <w:tblCellMar>
-            <w:top w:w="0" w:type="dxa"/>
-            <w:bottom w:w="0" w:type="dxa"/>
-          </w:tblCellMar>
-        </w:tblPrEx>
         <w:trPr>
           <w:trHeight w:val="258"/>
         </w:trPr>
@@ -6710,12 +6539,6 @@
         </w:tc>
       </w:tr>
       <w:tr>
-        <w:tblPrEx>
-          <w:tblCellMar>
-            <w:top w:w="0" w:type="dxa"/>
-            <w:bottom w:w="0" w:type="dxa"/>
-          </w:tblCellMar>
-        </w:tblPrEx>
         <w:trPr>
           <w:trHeight w:val="242"/>
         </w:trPr>
@@ -6751,12 +6574,6 @@
         </w:tc>
       </w:tr>
       <w:tr>
-        <w:tblPrEx>
-          <w:tblCellMar>
-            <w:top w:w="0" w:type="dxa"/>
-            <w:bottom w:w="0" w:type="dxa"/>
-          </w:tblCellMar>
-        </w:tblPrEx>
         <w:trPr>
           <w:trHeight w:val="258"/>
         </w:trPr>
@@ -6848,12 +6665,6 @@
         <w:gridCol w:w="7273"/>
       </w:tblGrid>
       <w:tr>
-        <w:tblPrEx>
-          <w:tblCellMar>
-            <w:top w:w="0" w:type="dxa"/>
-            <w:bottom w:w="0" w:type="dxa"/>
-          </w:tblCellMar>
-        </w:tblPrEx>
         <w:trPr>
           <w:trHeight w:val="259"/>
           <w:tblHeader/>
@@ -6904,12 +6715,6 @@
         </w:tc>
       </w:tr>
       <w:tr>
-        <w:tblPrEx>
-          <w:tblCellMar>
-            <w:top w:w="0" w:type="dxa"/>
-            <w:bottom w:w="0" w:type="dxa"/>
-          </w:tblCellMar>
-        </w:tblPrEx>
         <w:trPr>
           <w:trHeight w:val="244"/>
         </w:trPr>
@@ -6945,12 +6750,6 @@
         </w:tc>
       </w:tr>
       <w:tr>
-        <w:tblPrEx>
-          <w:tblCellMar>
-            <w:top w:w="0" w:type="dxa"/>
-            <w:bottom w:w="0" w:type="dxa"/>
-          </w:tblCellMar>
-        </w:tblPrEx>
         <w:trPr>
           <w:trHeight w:val="259"/>
         </w:trPr>
@@ -6986,12 +6785,6 @@
         </w:tc>
       </w:tr>
       <w:tr>
-        <w:tblPrEx>
-          <w:tblCellMar>
-            <w:top w:w="0" w:type="dxa"/>
-            <w:bottom w:w="0" w:type="dxa"/>
-          </w:tblCellMar>
-        </w:tblPrEx>
         <w:trPr>
           <w:trHeight w:val="259"/>
         </w:trPr>
@@ -7027,12 +6820,6 @@
         </w:tc>
       </w:tr>
       <w:tr>
-        <w:tblPrEx>
-          <w:tblCellMar>
-            <w:top w:w="0" w:type="dxa"/>
-            <w:bottom w:w="0" w:type="dxa"/>
-          </w:tblCellMar>
-        </w:tblPrEx>
         <w:trPr>
           <w:trHeight w:val="244"/>
         </w:trPr>
@@ -7068,12 +6855,6 @@
         </w:tc>
       </w:tr>
       <w:tr>
-        <w:tblPrEx>
-          <w:tblCellMar>
-            <w:top w:w="0" w:type="dxa"/>
-            <w:bottom w:w="0" w:type="dxa"/>
-          </w:tblCellMar>
-        </w:tblPrEx>
         <w:trPr>
           <w:trHeight w:val="259"/>
         </w:trPr>
@@ -7109,12 +6890,6 @@
         </w:tc>
       </w:tr>
       <w:tr>
-        <w:tblPrEx>
-          <w:tblCellMar>
-            <w:top w:w="0" w:type="dxa"/>
-            <w:bottom w:w="0" w:type="dxa"/>
-          </w:tblCellMar>
-        </w:tblPrEx>
         <w:trPr>
           <w:trHeight w:val="259"/>
         </w:trPr>
@@ -7150,12 +6925,6 @@
         </w:tc>
       </w:tr>
       <w:tr>
-        <w:tblPrEx>
-          <w:tblCellMar>
-            <w:top w:w="0" w:type="dxa"/>
-            <w:bottom w:w="0" w:type="dxa"/>
-          </w:tblCellMar>
-        </w:tblPrEx>
         <w:trPr>
           <w:trHeight w:val="244"/>
         </w:trPr>
@@ -7191,12 +6960,6 @@
         </w:tc>
       </w:tr>
       <w:tr>
-        <w:tblPrEx>
-          <w:tblCellMar>
-            <w:top w:w="0" w:type="dxa"/>
-            <w:bottom w:w="0" w:type="dxa"/>
-          </w:tblCellMar>
-        </w:tblPrEx>
         <w:trPr>
           <w:trHeight w:val="259"/>
         </w:trPr>
@@ -7394,12 +7157,6 @@
         <w:gridCol w:w="5400"/>
       </w:tblGrid>
       <w:tr>
-        <w:tblPrEx>
-          <w:tblCellMar>
-            <w:top w:w="0" w:type="dxa"/>
-            <w:bottom w:w="0" w:type="dxa"/>
-          </w:tblCellMar>
-        </w:tblPrEx>
         <w:trPr>
           <w:tblHeader/>
         </w:trPr>
@@ -7449,12 +7206,6 @@
         </w:tc>
       </w:tr>
       <w:tr>
-        <w:tblPrEx>
-          <w:tblCellMar>
-            <w:top w:w="0" w:type="dxa"/>
-            <w:bottom w:w="0" w:type="dxa"/>
-          </w:tblCellMar>
-        </w:tblPrEx>
         <w:tc>
           <w:tcPr>
             <w:tcW w:w="3600" w:type="dxa"/>
@@ -7487,12 +7238,6 @@
         </w:tc>
       </w:tr>
       <w:tr>
-        <w:tblPrEx>
-          <w:tblCellMar>
-            <w:top w:w="0" w:type="dxa"/>
-            <w:bottom w:w="0" w:type="dxa"/>
-          </w:tblCellMar>
-        </w:tblPrEx>
         <w:tc>
           <w:tcPr>
             <w:tcW w:w="3600" w:type="dxa"/>
@@ -7525,12 +7270,6 @@
         </w:tc>
       </w:tr>
       <w:tr>
-        <w:tblPrEx>
-          <w:tblCellMar>
-            <w:top w:w="0" w:type="dxa"/>
-            <w:bottom w:w="0" w:type="dxa"/>
-          </w:tblCellMar>
-        </w:tblPrEx>
         <w:tc>
           <w:tcPr>
             <w:tcW w:w="3600" w:type="dxa"/>
@@ -7563,12 +7302,6 @@
         </w:tc>
       </w:tr>
       <w:tr>
-        <w:tblPrEx>
-          <w:tblCellMar>
-            <w:top w:w="0" w:type="dxa"/>
-            <w:bottom w:w="0" w:type="dxa"/>
-          </w:tblCellMar>
-        </w:tblPrEx>
         <w:tc>
           <w:tcPr>
             <w:tcW w:w="3600" w:type="dxa"/>
@@ -7601,12 +7334,6 @@
         </w:tc>
       </w:tr>
       <w:tr>
-        <w:tblPrEx>
-          <w:tblCellMar>
-            <w:top w:w="0" w:type="dxa"/>
-            <w:bottom w:w="0" w:type="dxa"/>
-          </w:tblCellMar>
-        </w:tblPrEx>
         <w:tc>
           <w:tcPr>
             <w:tcW w:w="3600" w:type="dxa"/>
@@ -7639,12 +7366,6 @@
         </w:tc>
       </w:tr>
       <w:tr>
-        <w:tblPrEx>
-          <w:tblCellMar>
-            <w:top w:w="0" w:type="dxa"/>
-            <w:bottom w:w="0" w:type="dxa"/>
-          </w:tblCellMar>
-        </w:tblPrEx>
         <w:tc>
           <w:tcPr>
             <w:tcW w:w="3600" w:type="dxa"/>
@@ -7677,12 +7398,6 @@
         </w:tc>
       </w:tr>
       <w:tr>
-        <w:tblPrEx>
-          <w:tblCellMar>
-            <w:top w:w="0" w:type="dxa"/>
-            <w:bottom w:w="0" w:type="dxa"/>
-          </w:tblCellMar>
-        </w:tblPrEx>
         <w:tc>
           <w:tcPr>
             <w:tcW w:w="3600" w:type="dxa"/>
@@ -7715,12 +7430,6 @@
         </w:tc>
       </w:tr>
       <w:tr>
-        <w:tblPrEx>
-          <w:tblCellMar>
-            <w:top w:w="0" w:type="dxa"/>
-            <w:bottom w:w="0" w:type="dxa"/>
-          </w:tblCellMar>
-        </w:tblPrEx>
         <w:tc>
           <w:tcPr>
             <w:tcW w:w="3600" w:type="dxa"/>
@@ -7753,12 +7462,6 @@
         </w:tc>
       </w:tr>
       <w:tr>
-        <w:tblPrEx>
-          <w:tblCellMar>
-            <w:top w:w="0" w:type="dxa"/>
-            <w:bottom w:w="0" w:type="dxa"/>
-          </w:tblCellMar>
-        </w:tblPrEx>
         <w:tc>
           <w:tcPr>
             <w:tcW w:w="3600" w:type="dxa"/>
@@ -7791,12 +7494,6 @@
         </w:tc>
       </w:tr>
       <w:tr>
-        <w:tblPrEx>
-          <w:tblCellMar>
-            <w:top w:w="0" w:type="dxa"/>
-            <w:bottom w:w="0" w:type="dxa"/>
-          </w:tblCellMar>
-        </w:tblPrEx>
         <w:tc>
           <w:tcPr>
             <w:tcW w:w="3600" w:type="dxa"/>
@@ -7829,12 +7526,6 @@
         </w:tc>
       </w:tr>
       <w:tr>
-        <w:tblPrEx>
-          <w:tblCellMar>
-            <w:top w:w="0" w:type="dxa"/>
-            <w:bottom w:w="0" w:type="dxa"/>
-          </w:tblCellMar>
-        </w:tblPrEx>
         <w:tc>
           <w:tcPr>
             <w:tcW w:w="3600" w:type="dxa"/>
@@ -7867,12 +7558,6 @@
         </w:tc>
       </w:tr>
       <w:tr>
-        <w:tblPrEx>
-          <w:tblCellMar>
-            <w:top w:w="0" w:type="dxa"/>
-            <w:bottom w:w="0" w:type="dxa"/>
-          </w:tblCellMar>
-        </w:tblPrEx>
         <w:tc>
           <w:tcPr>
             <w:tcW w:w="3600" w:type="dxa"/>
@@ -7905,12 +7590,6 @@
         </w:tc>
       </w:tr>
       <w:tr>
-        <w:tblPrEx>
-          <w:tblCellMar>
-            <w:top w:w="0" w:type="dxa"/>
-            <w:bottom w:w="0" w:type="dxa"/>
-          </w:tblCellMar>
-        </w:tblPrEx>
         <w:tc>
           <w:tcPr>
             <w:tcW w:w="3600" w:type="dxa"/>
@@ -7943,12 +7622,6 @@
         </w:tc>
       </w:tr>
       <w:tr>
-        <w:tblPrEx>
-          <w:tblCellMar>
-            <w:top w:w="0" w:type="dxa"/>
-            <w:bottom w:w="0" w:type="dxa"/>
-          </w:tblCellMar>
-        </w:tblPrEx>
         <w:tc>
           <w:tcPr>
             <w:tcW w:w="3600" w:type="dxa"/>
@@ -8021,12 +7694,6 @@
         <w:gridCol w:w="4500"/>
       </w:tblGrid>
       <w:tr>
-        <w:tblPrEx>
-          <w:tblCellMar>
-            <w:top w:w="0" w:type="dxa"/>
-            <w:bottom w:w="0" w:type="dxa"/>
-          </w:tblCellMar>
-        </w:tblPrEx>
         <w:trPr>
           <w:tblHeader/>
         </w:trPr>
@@ -8076,12 +7743,6 @@
         </w:tc>
       </w:tr>
       <w:tr>
-        <w:tblPrEx>
-          <w:tblCellMar>
-            <w:top w:w="0" w:type="dxa"/>
-            <w:bottom w:w="0" w:type="dxa"/>
-          </w:tblCellMar>
-        </w:tblPrEx>
         <w:tc>
           <w:tcPr>
             <w:tcW w:w="4500" w:type="dxa"/>
@@ -8114,12 +7775,6 @@
         </w:tc>
       </w:tr>
       <w:tr>
-        <w:tblPrEx>
-          <w:tblCellMar>
-            <w:top w:w="0" w:type="dxa"/>
-            <w:bottom w:w="0" w:type="dxa"/>
-          </w:tblCellMar>
-        </w:tblPrEx>
         <w:tc>
           <w:tcPr>
             <w:tcW w:w="4500" w:type="dxa"/>
@@ -8152,12 +7807,6 @@
         </w:tc>
       </w:tr>
       <w:tr>
-        <w:tblPrEx>
-          <w:tblCellMar>
-            <w:top w:w="0" w:type="dxa"/>
-            <w:bottom w:w="0" w:type="dxa"/>
-          </w:tblCellMar>
-        </w:tblPrEx>
         <w:tc>
           <w:tcPr>
             <w:tcW w:w="4500" w:type="dxa"/>
@@ -8190,12 +7839,6 @@
         </w:tc>
       </w:tr>
       <w:tr>
-        <w:tblPrEx>
-          <w:tblCellMar>
-            <w:top w:w="0" w:type="dxa"/>
-            <w:bottom w:w="0" w:type="dxa"/>
-          </w:tblCellMar>
-        </w:tblPrEx>
         <w:tc>
           <w:tcPr>
             <w:tcW w:w="4500" w:type="dxa"/>
@@ -8276,12 +7919,6 @@
         <w:gridCol w:w="4744"/>
       </w:tblGrid>
       <w:tr>
-        <w:tblPrEx>
-          <w:tblCellMar>
-            <w:top w:w="0" w:type="dxa"/>
-            <w:bottom w:w="0" w:type="dxa"/>
-          </w:tblCellMar>
-        </w:tblPrEx>
         <w:trPr>
           <w:trHeight w:val="268"/>
           <w:tblHeader/>
@@ -8332,12 +7969,6 @@
         </w:tc>
       </w:tr>
       <w:tr>
-        <w:tblPrEx>
-          <w:tblCellMar>
-            <w:top w:w="0" w:type="dxa"/>
-            <w:bottom w:w="0" w:type="dxa"/>
-          </w:tblCellMar>
-        </w:tblPrEx>
         <w:trPr>
           <w:trHeight w:val="251"/>
         </w:trPr>
@@ -8373,12 +8004,6 @@
         </w:tc>
       </w:tr>
       <w:tr>
-        <w:tblPrEx>
-          <w:tblCellMar>
-            <w:top w:w="0" w:type="dxa"/>
-            <w:bottom w:w="0" w:type="dxa"/>
-          </w:tblCellMar>
-        </w:tblPrEx>
         <w:trPr>
           <w:trHeight w:val="268"/>
         </w:trPr>
@@ -8414,12 +8039,6 @@
         </w:tc>
       </w:tr>
       <w:tr>
-        <w:tblPrEx>
-          <w:tblCellMar>
-            <w:top w:w="0" w:type="dxa"/>
-            <w:bottom w:w="0" w:type="dxa"/>
-          </w:tblCellMar>
-        </w:tblPrEx>
         <w:trPr>
           <w:trHeight w:val="268"/>
         </w:trPr>
@@ -8455,12 +8074,6 @@
         </w:tc>
       </w:tr>
       <w:tr>
-        <w:tblPrEx>
-          <w:tblCellMar>
-            <w:top w:w="0" w:type="dxa"/>
-            <w:bottom w:w="0" w:type="dxa"/>
-          </w:tblCellMar>
-        </w:tblPrEx>
         <w:trPr>
           <w:trHeight w:val="251"/>
         </w:trPr>
@@ -8496,12 +8109,6 @@
         </w:tc>
       </w:tr>
       <w:tr>
-        <w:tblPrEx>
-          <w:tblCellMar>
-            <w:top w:w="0" w:type="dxa"/>
-            <w:bottom w:w="0" w:type="dxa"/>
-          </w:tblCellMar>
-        </w:tblPrEx>
         <w:trPr>
           <w:trHeight w:val="268"/>
         </w:trPr>
@@ -8588,12 +8195,6 @@
         <w:gridCol w:w="5194"/>
       </w:tblGrid>
       <w:tr>
-        <w:tblPrEx>
-          <w:tblCellMar>
-            <w:top w:w="0" w:type="dxa"/>
-            <w:bottom w:w="0" w:type="dxa"/>
-          </w:tblCellMar>
-        </w:tblPrEx>
         <w:trPr>
           <w:trHeight w:val="400"/>
           <w:tblHeader/>
@@ -8688,12 +8289,6 @@
         </w:tc>
       </w:tr>
       <w:tr>
-        <w:tblPrEx>
-          <w:tblCellMar>
-            <w:top w:w="0" w:type="dxa"/>
-            <w:bottom w:w="0" w:type="dxa"/>
-          </w:tblCellMar>
-        </w:tblPrEx>
         <w:trPr>
           <w:trHeight w:val="376"/>
         </w:trPr>
@@ -8759,12 +8354,6 @@
         </w:tc>
       </w:tr>
       <w:tr>
-        <w:tblPrEx>
-          <w:tblCellMar>
-            <w:top w:w="0" w:type="dxa"/>
-            <w:bottom w:w="0" w:type="dxa"/>
-          </w:tblCellMar>
-        </w:tblPrEx>
         <w:trPr>
           <w:trHeight w:val="400"/>
         </w:trPr>
@@ -8830,12 +8419,6 @@
         </w:tc>
       </w:tr>
       <w:tr>
-        <w:tblPrEx>
-          <w:tblCellMar>
-            <w:top w:w="0" w:type="dxa"/>
-            <w:bottom w:w="0" w:type="dxa"/>
-          </w:tblCellMar>
-        </w:tblPrEx>
         <w:trPr>
           <w:trHeight w:val="376"/>
         </w:trPr>
@@ -8949,12 +8532,6 @@
         <w:gridCol w:w="4961"/>
       </w:tblGrid>
       <w:tr>
-        <w:tblPrEx>
-          <w:tblCellMar>
-            <w:top w:w="0" w:type="dxa"/>
-            <w:bottom w:w="0" w:type="dxa"/>
-          </w:tblCellMar>
-        </w:tblPrEx>
         <w:trPr>
           <w:trHeight w:val="349"/>
           <w:tblHeader/>
@@ -9005,12 +8582,6 @@
         </w:tc>
       </w:tr>
       <w:tr>
-        <w:tblPrEx>
-          <w:tblCellMar>
-            <w:top w:w="0" w:type="dxa"/>
-            <w:bottom w:w="0" w:type="dxa"/>
-          </w:tblCellMar>
-        </w:tblPrEx>
         <w:trPr>
           <w:trHeight w:val="328"/>
         </w:trPr>
@@ -9046,12 +8617,6 @@
         </w:tc>
       </w:tr>
       <w:tr>
-        <w:tblPrEx>
-          <w:tblCellMar>
-            <w:top w:w="0" w:type="dxa"/>
-            <w:bottom w:w="0" w:type="dxa"/>
-          </w:tblCellMar>
-        </w:tblPrEx>
         <w:trPr>
           <w:trHeight w:val="349"/>
         </w:trPr>
@@ -9087,12 +8652,6 @@
         </w:tc>
       </w:tr>
       <w:tr>
-        <w:tblPrEx>
-          <w:tblCellMar>
-            <w:top w:w="0" w:type="dxa"/>
-            <w:bottom w:w="0" w:type="dxa"/>
-          </w:tblCellMar>
-        </w:tblPrEx>
         <w:trPr>
           <w:trHeight w:val="349"/>
         </w:trPr>
@@ -9128,12 +8687,6 @@
         </w:tc>
       </w:tr>
       <w:tr>
-        <w:tblPrEx>
-          <w:tblCellMar>
-            <w:top w:w="0" w:type="dxa"/>
-            <w:bottom w:w="0" w:type="dxa"/>
-          </w:tblCellMar>
-        </w:tblPrEx>
         <w:trPr>
           <w:trHeight w:val="328"/>
         </w:trPr>
@@ -9217,12 +8770,6 @@
         <w:gridCol w:w="4982"/>
       </w:tblGrid>
       <w:tr>
-        <w:tblPrEx>
-          <w:tblCellMar>
-            <w:top w:w="0" w:type="dxa"/>
-            <w:bottom w:w="0" w:type="dxa"/>
-          </w:tblCellMar>
-        </w:tblPrEx>
         <w:trPr>
           <w:trHeight w:val="272"/>
           <w:tblHeader/>
@@ -9273,12 +8820,6 @@
         </w:tc>
       </w:tr>
       <w:tr>
-        <w:tblPrEx>
-          <w:tblCellMar>
-            <w:top w:w="0" w:type="dxa"/>
-            <w:bottom w:w="0" w:type="dxa"/>
-          </w:tblCellMar>
-        </w:tblPrEx>
         <w:trPr>
           <w:trHeight w:val="255"/>
         </w:trPr>
@@ -9314,12 +8855,6 @@
         </w:tc>
       </w:tr>
       <w:tr>
-        <w:tblPrEx>
-          <w:tblCellMar>
-            <w:top w:w="0" w:type="dxa"/>
-            <w:bottom w:w="0" w:type="dxa"/>
-          </w:tblCellMar>
-        </w:tblPrEx>
         <w:trPr>
           <w:trHeight w:val="272"/>
         </w:trPr>
@@ -9355,12 +8890,6 @@
         </w:tc>
       </w:tr>
       <w:tr>
-        <w:tblPrEx>
-          <w:tblCellMar>
-            <w:top w:w="0" w:type="dxa"/>
-            <w:bottom w:w="0" w:type="dxa"/>
-          </w:tblCellMar>
-        </w:tblPrEx>
         <w:trPr>
           <w:trHeight w:val="272"/>
         </w:trPr>
@@ -9396,12 +8925,6 @@
         </w:tc>
       </w:tr>
       <w:tr>
-        <w:tblPrEx>
-          <w:tblCellMar>
-            <w:top w:w="0" w:type="dxa"/>
-            <w:bottom w:w="0" w:type="dxa"/>
-          </w:tblCellMar>
-        </w:tblPrEx>
         <w:trPr>
           <w:trHeight w:val="255"/>
         </w:trPr>
@@ -9437,12 +8960,6 @@
         </w:tc>
       </w:tr>
       <w:tr>
-        <w:tblPrEx>
-          <w:tblCellMar>
-            <w:top w:w="0" w:type="dxa"/>
-            <w:bottom w:w="0" w:type="dxa"/>
-          </w:tblCellMar>
-        </w:tblPrEx>
         <w:trPr>
           <w:trHeight w:val="272"/>
         </w:trPr>
@@ -9478,12 +8995,6 @@
         </w:tc>
       </w:tr>
       <w:tr>
-        <w:tblPrEx>
-          <w:tblCellMar>
-            <w:top w:w="0" w:type="dxa"/>
-            <w:bottom w:w="0" w:type="dxa"/>
-          </w:tblCellMar>
-        </w:tblPrEx>
         <w:trPr>
           <w:trHeight w:val="255"/>
         </w:trPr>
@@ -9587,10 +9098,10 @@
       </w:pPr>
       <w:r>
         <w:drawing>
-          <wp:inline distT="0" distB="0" distL="0" distR="0" wp14:anchorId="491C7D16" wp14:editId="7D3C3697">
-            <wp:extent cx="6400800" cy="3597275"/>
-            <wp:effectExtent l="0" t="0" r="0" b="3175"/>
-            <wp:docPr id="1362551130" name="Picture 1"/>
+          <wp:inline distT="0" distB="0" distL="0" distR="0" wp14:anchorId="5622E709" wp14:editId="397C362C">
+            <wp:extent cx="4210493" cy="2261870"/>
+            <wp:effectExtent l="0" t="0" r="0" b="5080"/>
+            <wp:docPr id="310165577" name="Picture 1"/>
             <wp:cNvGraphicFramePr>
               <a:graphicFrameLocks xmlns:a="http://schemas.openxmlformats.org/drawingml/2006/main" noChangeAspect="1"/>
             </wp:cNvGraphicFramePr>
@@ -9604,7 +9115,7 @@
                     </pic:cNvPicPr>
                   </pic:nvPicPr>
                   <pic:blipFill>
-                    <a:blip r:embed="rId9" cstate="print">
+                    <a:blip r:embed="rId9">
                       <a:extLst>
                         <a:ext uri="{28A0092B-C50C-407E-A947-70E740481C1C}">
                           <a14:useLocalDpi xmlns:a14="http://schemas.microsoft.com/office/drawing/2010/main" val="0"/>
@@ -9619,7 +9130,7 @@
                   <pic:spPr bwMode="auto">
                     <a:xfrm>
                       <a:off x="0" y="0"/>
-                      <a:ext cx="6400800" cy="3597275"/>
+                      <a:ext cx="4216314" cy="2264997"/>
                     </a:xfrm>
                     <a:prstGeom prst="rect">
                       <a:avLst/>
@@ -9638,12 +9149,6 @@
     </w:p>
     <w:p>
       <w:pPr>
-        <w:spacing w:before="60" w:after="60"/>
-        <w:jc w:val="both"/>
-      </w:pPr>
-    </w:p>
-    <w:p>
-      <w:pPr>
         <w:pStyle w:val="Heading2"/>
       </w:pPr>
     </w:p>
@@ -9651,43 +9156,7 @@
       <w:pPr>
         <w:pStyle w:val="Heading2"/>
       </w:pPr>
-    </w:p>
-    <w:p>
-      <w:pPr>
-        <w:pStyle w:val="Heading2"/>
-      </w:pPr>
-    </w:p>
-    <w:p>
-      <w:pPr>
-        <w:pStyle w:val="Heading2"/>
-      </w:pPr>
-    </w:p>
-    <w:p>
-      <w:pPr>
-        <w:pStyle w:val="Heading2"/>
-      </w:pPr>
-    </w:p>
-    <w:p>
-      <w:pPr>
-        <w:pStyle w:val="Heading2"/>
-      </w:pPr>
-    </w:p>
-    <w:p>
-      <w:pPr>
-        <w:pStyle w:val="Heading2"/>
-      </w:pPr>
-    </w:p>
-    <w:p>
-      <w:pPr>
-        <w:pStyle w:val="Heading2"/>
-      </w:pPr>
-    </w:p>
-    <w:p>
-      <w:pPr>
-        <w:pStyle w:val="Heading2"/>
-      </w:pPr>
-      <w:r>
-        <w:lastRenderedPageBreak/>
+      <w:r>
         <w:t>Figure 2: Dense Optical Flow Output (optical_flow.mp4)</w:t>
       </w:r>
     </w:p>
@@ -9705,18 +9174,12 @@
         <w:spacing w:before="60" w:after="60"/>
         <w:jc w:val="both"/>
       </w:pPr>
-    </w:p>
-    <w:p>
-      <w:pPr>
-        <w:spacing w:before="60" w:after="60"/>
-        <w:jc w:val="both"/>
-      </w:pPr>
       <w:r>
         <w:drawing>
-          <wp:inline distT="0" distB="0" distL="0" distR="0" wp14:anchorId="7DBAEDA3" wp14:editId="230E6064">
-            <wp:extent cx="6400800" cy="4761865"/>
-            <wp:effectExtent l="0" t="0" r="0" b="635"/>
-            <wp:docPr id="1048044441" name="Picture 2"/>
+          <wp:inline distT="0" distB="0" distL="0" distR="0" wp14:anchorId="6ECDC473" wp14:editId="1A29C9B5">
+            <wp:extent cx="2454275" cy="1828800"/>
+            <wp:effectExtent l="0" t="0" r="3175" b="0"/>
+            <wp:docPr id="331337074" name="Picture 2"/>
             <wp:cNvGraphicFramePr>
               <a:graphicFrameLocks xmlns:a="http://schemas.openxmlformats.org/drawingml/2006/main" noChangeAspect="1"/>
             </wp:cNvGraphicFramePr>
@@ -9745,7 +9208,7 @@
                   <pic:spPr bwMode="auto">
                     <a:xfrm>
                       <a:off x="0" y="0"/>
-                      <a:ext cx="6400800" cy="4761865"/>
+                      <a:ext cx="2454275" cy="1828800"/>
                     </a:xfrm>
                     <a:prstGeom prst="rect">
                       <a:avLst/>
@@ -9764,32 +9227,8 @@
     </w:p>
     <w:p>
       <w:pPr>
-        <w:pStyle w:val="Heading2"/>
-      </w:pPr>
-    </w:p>
-    <w:p>
-      <w:pPr>
-        <w:pStyle w:val="Heading2"/>
-      </w:pPr>
-    </w:p>
-    <w:p>
-      <w:pPr>
-        <w:pStyle w:val="Heading2"/>
-      </w:pPr>
-    </w:p>
-    <w:p>
-      <w:pPr>
-        <w:pStyle w:val="Heading2"/>
-      </w:pPr>
-    </w:p>
-    <w:p>
-      <w:pPr>
-        <w:pStyle w:val="Heading2"/>
-      </w:pPr>
-    </w:p>
-    <w:p>
-      <w:pPr>
-        <w:pStyle w:val="Heading2"/>
+        <w:spacing w:before="60" w:after="60"/>
+        <w:jc w:val="both"/>
       </w:pPr>
     </w:p>
     <w:p>
@@ -9820,18 +9259,12 @@
         <w:spacing w:before="60" w:after="60"/>
         <w:jc w:val="both"/>
       </w:pPr>
-    </w:p>
-    <w:p>
-      <w:pPr>
-        <w:spacing w:before="60" w:after="60"/>
-        <w:jc w:val="both"/>
-      </w:pPr>
       <w:r>
         <w:drawing>
-          <wp:inline distT="0" distB="0" distL="0" distR="0" wp14:anchorId="14956439" wp14:editId="00D922E6">
-            <wp:extent cx="6391910" cy="4779010"/>
-            <wp:effectExtent l="0" t="0" r="8890" b="2540"/>
-            <wp:docPr id="477352261" name="Picture 3"/>
+          <wp:inline distT="0" distB="0" distL="0" distR="0" wp14:anchorId="63A7D58A" wp14:editId="7C829B02">
+            <wp:extent cx="2891790" cy="2137410"/>
+            <wp:effectExtent l="0" t="0" r="3810" b="0"/>
+            <wp:docPr id="1707506804" name="Picture 3"/>
             <wp:cNvGraphicFramePr>
               <a:graphicFrameLocks xmlns:a="http://schemas.openxmlformats.org/drawingml/2006/main" noChangeAspect="1"/>
             </wp:cNvGraphicFramePr>
@@ -9860,7 +9293,7 @@
                   <pic:spPr bwMode="auto">
                     <a:xfrm>
                       <a:off x="0" y="0"/>
-                      <a:ext cx="6391910" cy="4779010"/>
+                      <a:ext cx="2891790" cy="2137410"/>
                     </a:xfrm>
                     <a:prstGeom prst="rect">
                       <a:avLst/>
@@ -9879,6 +9312,12 @@
     </w:p>
     <w:p>
       <w:pPr>
+        <w:spacing w:before="60" w:after="60"/>
+        <w:jc w:val="both"/>
+      </w:pPr>
+    </w:p>
+    <w:p>
+      <w:pPr>
         <w:pStyle w:val="Heading2"/>
       </w:pPr>
       <w:r>
@@ -9895,16 +9334,10 @@
       </w:r>
     </w:p>
     <w:p>
-      <w:r>
-        <w:br w:type="page"/>
-      </w:r>
-    </w:p>
-    <w:p>
       <w:pPr>
         <w:pStyle w:val="Heading1"/>
       </w:pPr>
       <w:r>
-        <w:lastRenderedPageBreak/>
         <w:t>17. COMPARATIVE ANALYSIS</w:t>
       </w:r>
     </w:p>
@@ -9951,12 +9384,6 @@
         <w:gridCol w:w="2462"/>
       </w:tblGrid>
       <w:tr>
-        <w:tblPrEx>
-          <w:tblCellMar>
-            <w:top w:w="0" w:type="dxa"/>
-            <w:bottom w:w="0" w:type="dxa"/>
-          </w:tblCellMar>
-        </w:tblPrEx>
         <w:trPr>
           <w:trHeight w:val="280"/>
           <w:tblHeader/>
@@ -10073,12 +9500,6 @@
         </w:tc>
       </w:tr>
       <w:tr>
-        <w:tblPrEx>
-          <w:tblCellMar>
-            <w:top w:w="0" w:type="dxa"/>
-            <w:bottom w:w="0" w:type="dxa"/>
-          </w:tblCellMar>
-        </w:tblPrEx>
         <w:trPr>
           <w:trHeight w:val="1104"/>
         </w:trPr>
@@ -10159,12 +9580,6 @@
         </w:tc>
       </w:tr>
       <w:tr>
-        <w:tblPrEx>
-          <w:tblCellMar>
-            <w:top w:w="0" w:type="dxa"/>
-            <w:bottom w:w="0" w:type="dxa"/>
-          </w:tblCellMar>
-        </w:tblPrEx>
         <w:trPr>
           <w:trHeight w:val="1385"/>
         </w:trPr>
@@ -10245,12 +9660,6 @@
         </w:tc>
       </w:tr>
       <w:tr>
-        <w:tblPrEx>
-          <w:tblCellMar>
-            <w:top w:w="0" w:type="dxa"/>
-            <w:bottom w:w="0" w:type="dxa"/>
-          </w:tblCellMar>
-        </w:tblPrEx>
         <w:trPr>
           <w:trHeight w:val="1402"/>
         </w:trPr>
@@ -10337,6 +9746,7 @@
         <w:jc w:val="both"/>
       </w:pPr>
       <w:r>
+        <w:lastRenderedPageBreak/>
         <w:t>In practical terms: for counting objects, measuring individual speeds, or distinguishing between multiple entities, MOG2 + Centroid Tracking is most appropriate from this set. For measuring overall scene motion, dense optical flow provides a direct answer. For efficiently tracking specific visual landmarks over time, KLT is suitable. The three methods are best used in combination when a comprehensive analysis is required.</w:t>
       </w:r>
     </w:p>
@@ -10391,12 +9801,6 @@
         <w:gridCol w:w="1742"/>
       </w:tblGrid>
       <w:tr>
-        <w:tblPrEx>
-          <w:tblCellMar>
-            <w:top w:w="0" w:type="dxa"/>
-            <w:bottom w:w="0" w:type="dxa"/>
-          </w:tblCellMar>
-        </w:tblPrEx>
         <w:trPr>
           <w:trHeight w:val="270"/>
           <w:tblHeader/>
@@ -10491,12 +9895,6 @@
         </w:tc>
       </w:tr>
       <w:tr>
-        <w:tblPrEx>
-          <w:tblCellMar>
-            <w:top w:w="0" w:type="dxa"/>
-            <w:bottom w:w="0" w:type="dxa"/>
-          </w:tblCellMar>
-        </w:tblPrEx>
         <w:trPr>
           <w:trHeight w:val="253"/>
         </w:trPr>
@@ -10562,12 +9960,6 @@
         </w:tc>
       </w:tr>
       <w:tr>
-        <w:tblPrEx>
-          <w:tblCellMar>
-            <w:top w:w="0" w:type="dxa"/>
-            <w:bottom w:w="0" w:type="dxa"/>
-          </w:tblCellMar>
-        </w:tblPrEx>
         <w:trPr>
           <w:trHeight w:val="540"/>
         </w:trPr>
@@ -10633,12 +10025,6 @@
         </w:tc>
       </w:tr>
       <w:tr>
-        <w:tblPrEx>
-          <w:tblCellMar>
-            <w:top w:w="0" w:type="dxa"/>
-            <w:bottom w:w="0" w:type="dxa"/>
-          </w:tblCellMar>
-        </w:tblPrEx>
         <w:trPr>
           <w:trHeight w:val="540"/>
         </w:trPr>
@@ -10704,12 +10090,6 @@
         </w:tc>
       </w:tr>
       <w:tr>
-        <w:tblPrEx>
-          <w:tblCellMar>
-            <w:top w:w="0" w:type="dxa"/>
-            <w:bottom w:w="0" w:type="dxa"/>
-          </w:tblCellMar>
-        </w:tblPrEx>
         <w:trPr>
           <w:trHeight w:val="524"/>
         </w:trPr>
@@ -10775,12 +10155,6 @@
         </w:tc>
       </w:tr>
       <w:tr>
-        <w:tblPrEx>
-          <w:tblCellMar>
-            <w:top w:w="0" w:type="dxa"/>
-            <w:bottom w:w="0" w:type="dxa"/>
-          </w:tblCellMar>
-        </w:tblPrEx>
         <w:trPr>
           <w:trHeight w:val="811"/>
         </w:trPr>
@@ -10846,12 +10220,6 @@
         </w:tc>
       </w:tr>
       <w:tr>
-        <w:tblPrEx>
-          <w:tblCellMar>
-            <w:top w:w="0" w:type="dxa"/>
-            <w:bottom w:w="0" w:type="dxa"/>
-          </w:tblCellMar>
-        </w:tblPrEx>
         <w:trPr>
           <w:trHeight w:val="524"/>
         </w:trPr>
@@ -10866,7 +10234,6 @@
                 <w:sz w:val="20"/>
                 <w:szCs w:val="20"/>
               </w:rPr>
-              <w:lastRenderedPageBreak/>
               <w:t>test_preprocessing.py</w:t>
             </w:r>
           </w:p>
@@ -10918,12 +10285,6 @@
         </w:tc>
       </w:tr>
       <w:tr>
-        <w:tblPrEx>
-          <w:tblCellMar>
-            <w:top w:w="0" w:type="dxa"/>
-            <w:bottom w:w="0" w:type="dxa"/>
-          </w:tblCellMar>
-        </w:tblPrEx>
         <w:trPr>
           <w:trHeight w:val="540"/>
         </w:trPr>
@@ -10989,12 +10350,6 @@
         </w:tc>
       </w:tr>
       <w:tr>
-        <w:tblPrEx>
-          <w:tblCellMar>
-            <w:top w:w="0" w:type="dxa"/>
-            <w:bottom w:w="0" w:type="dxa"/>
-          </w:tblCellMar>
-        </w:tblPrEx>
         <w:trPr>
           <w:trHeight w:val="524"/>
         </w:trPr>
@@ -11060,12 +10415,6 @@
         </w:tc>
       </w:tr>
       <w:tr>
-        <w:tblPrEx>
-          <w:tblCellMar>
-            <w:top w:w="0" w:type="dxa"/>
-            <w:bottom w:w="0" w:type="dxa"/>
-          </w:tblCellMar>
-        </w:tblPrEx>
         <w:trPr>
           <w:trHeight w:val="540"/>
         </w:trPr>
@@ -11131,12 +10480,6 @@
         </w:tc>
       </w:tr>
       <w:tr>
-        <w:tblPrEx>
-          <w:tblCellMar>
-            <w:top w:w="0" w:type="dxa"/>
-            <w:bottom w:w="0" w:type="dxa"/>
-          </w:tblCellMar>
-        </w:tblPrEx>
         <w:trPr>
           <w:trHeight w:val="524"/>
         </w:trPr>
@@ -11260,6 +10603,7 @@
         <w:jc w:val="both"/>
       </w:pPr>
       <w:r>
+        <w:lastRenderedPageBreak/>
         <w:t>Even if the file exists, cv2.VideoCapture.isOpened() may return False if the codec is unsupported or the file is corrupt. The processor checks isOpened() and handles this identically to a missing file.</w:t>
       </w:r>
     </w:p>
@@ -11359,34 +10703,9 @@
     </w:p>
     <w:p>
       <w:pPr>
-        <w:spacing w:before="60" w:after="60"/>
-        <w:jc w:val="both"/>
-      </w:pPr>
-    </w:p>
-    <w:p>
-      <w:pPr>
-        <w:spacing w:before="60" w:after="60"/>
-        <w:jc w:val="both"/>
-      </w:pPr>
-    </w:p>
-    <w:p>
-      <w:pPr>
-        <w:spacing w:before="60" w:after="60"/>
-        <w:jc w:val="both"/>
-      </w:pPr>
-    </w:p>
-    <w:p>
-      <w:pPr>
-        <w:spacing w:before="60" w:after="60"/>
-        <w:jc w:val="both"/>
-      </w:pPr>
-    </w:p>
-    <w:p>
-      <w:pPr>
         <w:pStyle w:val="Heading1"/>
       </w:pPr>
       <w:r>
-        <w:lastRenderedPageBreak/>
         <w:t>20. IMPLEMENTATION DETAILS</w:t>
       </w:r>
     </w:p>
@@ -11430,12 +10749,6 @@
         <w:gridCol w:w="6490"/>
       </w:tblGrid>
       <w:tr>
-        <w:tblPrEx>
-          <w:tblCellMar>
-            <w:top w:w="0" w:type="dxa"/>
-            <w:bottom w:w="0" w:type="dxa"/>
-          </w:tblCellMar>
-        </w:tblPrEx>
         <w:trPr>
           <w:trHeight w:val="301"/>
           <w:tblHeader/>
@@ -11508,12 +10821,6 @@
         </w:tc>
       </w:tr>
       <w:tr>
-        <w:tblPrEx>
-          <w:tblCellMar>
-            <w:top w:w="0" w:type="dxa"/>
-            <w:bottom w:w="0" w:type="dxa"/>
-          </w:tblCellMar>
-        </w:tblPrEx>
         <w:trPr>
           <w:trHeight w:val="584"/>
         </w:trPr>
@@ -11564,12 +10871,6 @@
         </w:tc>
       </w:tr>
       <w:tr>
-        <w:tblPrEx>
-          <w:tblCellMar>
-            <w:top w:w="0" w:type="dxa"/>
-            <w:bottom w:w="0" w:type="dxa"/>
-          </w:tblCellMar>
-        </w:tblPrEx>
         <w:trPr>
           <w:trHeight w:val="602"/>
         </w:trPr>
@@ -11620,12 +10921,6 @@
         </w:tc>
       </w:tr>
       <w:tr>
-        <w:tblPrEx>
-          <w:tblCellMar>
-            <w:top w:w="0" w:type="dxa"/>
-            <w:bottom w:w="0" w:type="dxa"/>
-          </w:tblCellMar>
-        </w:tblPrEx>
         <w:trPr>
           <w:trHeight w:val="584"/>
         </w:trPr>
@@ -11676,12 +10971,6 @@
         </w:tc>
       </w:tr>
       <w:tr>
-        <w:tblPrEx>
-          <w:tblCellMar>
-            <w:top w:w="0" w:type="dxa"/>
-            <w:bottom w:w="0" w:type="dxa"/>
-          </w:tblCellMar>
-        </w:tblPrEx>
         <w:trPr>
           <w:trHeight w:val="301"/>
         </w:trPr>
@@ -11732,12 +11021,6 @@
         </w:tc>
       </w:tr>
       <w:tr>
-        <w:tblPrEx>
-          <w:tblCellMar>
-            <w:top w:w="0" w:type="dxa"/>
-            <w:bottom w:w="0" w:type="dxa"/>
-          </w:tblCellMar>
-        </w:tblPrEx>
         <w:trPr>
           <w:trHeight w:val="301"/>
         </w:trPr>
@@ -11788,12 +11071,6 @@
         </w:tc>
       </w:tr>
       <w:tr>
-        <w:tblPrEx>
-          <w:tblCellMar>
-            <w:top w:w="0" w:type="dxa"/>
-            <w:bottom w:w="0" w:type="dxa"/>
-          </w:tblCellMar>
-        </w:tblPrEx>
         <w:trPr>
           <w:trHeight w:val="283"/>
         </w:trPr>
@@ -11907,6 +11184,7 @@
           <w:bCs/>
           <w:color w:val="2E4B8F"/>
         </w:rPr>
+        <w:lastRenderedPageBreak/>
         <w:t>Warmup Period</w:t>
       </w:r>
     </w:p>
@@ -11996,7 +11274,6 @@
         <w:pStyle w:val="Heading1"/>
       </w:pPr>
       <w:r>
-        <w:lastRenderedPageBreak/>
         <w:t>21. DESIGN DECISIONS AND RATIONALE</w:t>
       </w:r>
     </w:p>
@@ -12129,7 +11406,11 @@
         <w:jc w:val="both"/>
       </w:pPr>
       <w:r>
-        <w:t>Creating ground truth for real video requires manual frame-by-frame annotation, which is time-consuming and error-prone. Synthetic data allows exact ground truth to be generated automatically, making evaluation objective and reproducible. The trade-off is that synthetic scenarios are simpler than real-world scenes.</w:t>
+        <w:t xml:space="preserve">Creating ground truth for real video requires manual frame-by-frame annotation, which is time-consuming and error-prone. Synthetic data allows exact ground truth to be generated automatically, making </w:t>
+      </w:r>
+      <w:r>
+        <w:lastRenderedPageBreak/>
+        <w:t>evaluation objective and reproducible. The trade-off is that synthetic scenarios are simpler than real-world scenes.</w:t>
       </w:r>
     </w:p>
     <w:p>
@@ -12155,16 +11436,10 @@
       </w:r>
     </w:p>
     <w:p>
-      <w:r>
-        <w:br w:type="page"/>
-      </w:r>
-    </w:p>
-    <w:p>
       <w:pPr>
         <w:pStyle w:val="Heading1"/>
       </w:pPr>
       <w:r>
-        <w:lastRenderedPageBreak/>
         <w:t>22. CHALLENGES FACED</w:t>
       </w:r>
     </w:p>
@@ -12371,6 +11646,7 @@
         <w:jc w:val="both"/>
       </w:pPr>
       <w:r>
+        <w:lastRenderedPageBreak/>
         <w:t>The system detects and tracks moving regions as blobs. All regions above min_area are treated identically regardless of shape, size, or appearance.</w:t>
       </w:r>
     </w:p>
@@ -12406,7 +11682,6 @@
           <w:bCs/>
           <w:color w:val="2E4B8F"/>
         </w:rPr>
-        <w:lastRenderedPageBreak/>
         <w:t>KLT Tracks Features, Not Objects</w:t>
       </w:r>
     </w:p>
@@ -12609,6 +11884,7 @@
         <w:jc w:val="both"/>
       </w:pPr>
       <w:r>
+        <w:lastRenderedPageBreak/>
         <w:t>Without the synthetic ground truth CSV it would be impossible to numerically assess tracker performance. Building the evaluation script reinforced the importance of reproducible ground truth and the care required to define a matching protocol.</w:t>
       </w:r>
     </w:p>
@@ -12631,7 +11907,6 @@
         <w:jc w:val="both"/>
       </w:pPr>
       <w:r>
-        <w:lastRenderedPageBreak/>
         <w:t>Separating preprocessing, background subtraction, detection, tracking, and visualisation into distinct modules made it possible to test each component independently. Unit tests helped narrow the source of problems to a specific module.</w:t>
       </w:r>
     </w:p>
@@ -12825,6 +12100,7 @@
         <w:jc w:val="both"/>
       </w:pPr>
       <w:r>
+        <w:lastRenderedPageBreak/>
         <w:t>Testing against multi-object tracking benchmarks such as MOT Challenge would provide comparison with published methods, requiring extended support for MOTA, MOTP, and ID-switch metrics.</w:t>
       </w:r>
     </w:p>
@@ -12847,7 +12123,6 @@
         <w:jc w:val="both"/>
       </w:pPr>
       <w:r>
-        <w:lastRenderedPageBreak/>
         <w:t>An optional argument could allow the system to use a lightweight detector in place of MOG2 for foreground extraction, enabling direct comparison between classical and learned detectors within the same tracking framework.</w:t>
       </w:r>
     </w:p>
@@ -12934,7 +12209,6 @@
         <w:jc w:val="center"/>
       </w:pPr>
       <w:r>
-        <w:lastRenderedPageBreak/>
         <w:t>REFERENCES</w:t>
       </w:r>
     </w:p>
@@ -13800,6 +13074,7 @@
   <w:style w:type="character" w:default="1" w:styleId="DefaultParagraphFont">
     <w:name w:val="Default Paragraph Font"/>
     <w:uiPriority w:val="1"/>
+    <w:semiHidden/>
     <w:unhideWhenUsed/>
   </w:style>
   <w:style w:type="table" w:default="1" w:styleId="TableNormal">

</xml_diff>